<commit_message>
Regenerate AJBA package with all BioEssays figures
Co-Authored-By: Tatsuki Onishi <bougtoir@gmail.com>
</commit_message>
<xml_diff>
--- a/denisovan-archaic-dna-analysis/docs/ajba_submission/manuscript_ajba.docx
+++ b/denisovan-archaic-dna-analysis/docs/ajba_submission/manuscript_ajba.docx
@@ -441,7 +441,7 @@
         <w:pStyle w:val="Heading2"/>
       </w:pPr>
       <w:r>
-        <w:t>Population structure and robustness</w:t>
+        <w:t>Population structure</w:t>
       </w:r>
     </w:p>
     <w:p>
@@ -454,7 +454,49 @@
           <w:i w:val="0"/>
           <w:sz w:val="24"/>
         </w:rPr>
-        <w:t>The representative heat maps showed broad regional blocks and a stronger Oceanian contrast in the Denisovan profile (Figure 2). The complete 66-population heat map is provided as Figure S1. Negative distance correlations were examined across admixture exclusions, within-dataset subsets, minimum sample sizes, and regional omissions (Figure 3). Window-size results at 250 kb, 500 kb, and 1 Mb are shown in Figure S2. These analyses were treated as robustness checks rather than independent confirmatory tests.</w:t>
+        <w:t>The representative heat maps showed broad regional blocks and a stronger Oceanian contrast in the Denisovan profile (Figure 2). The complete 66-population heat map is provided as Figure S1.</w:t>
+      </w:r>
+    </w:p>
+    <w:p>
+      <w:pPr>
+        <w:pStyle w:val="Heading2"/>
+      </w:pPr>
+      <w:r>
+        <w:t>Schematic dispersal context</w:t>
+      </w:r>
+    </w:p>
+    <w:p>
+      <w:pPr>
+        <w:ind w:firstLine="432"/>
+      </w:pPr>
+      <w:r>
+        <w:rPr>
+          <w:rFonts w:ascii="Times New Roman" w:hAnsi="Times New Roman"/>
+          <w:i w:val="0"/>
+          <w:sz w:val="24"/>
+        </w:rPr>
+        <w:t>A polygon-based Minard diagram retains the dispersal and archaic-introgression context developed for the earlier BioEssays version (Figure 3). Band widths, branch positions, and event placement are schematic and are not estimates from the present pairwise analysis.</w:t>
+      </w:r>
+    </w:p>
+    <w:p>
+      <w:pPr>
+        <w:pStyle w:val="Heading2"/>
+      </w:pPr>
+      <w:r>
+        <w:t>Robustness analyses</w:t>
+      </w:r>
+    </w:p>
+    <w:p>
+      <w:pPr>
+        <w:ind w:firstLine="432"/>
+      </w:pPr>
+      <w:r>
+        <w:rPr>
+          <w:rFonts w:ascii="Times New Roman" w:hAnsi="Times New Roman"/>
+          <w:i w:val="0"/>
+          <w:sz w:val="24"/>
+        </w:rPr>
+        <w:t>Negative distance correlations were examined across admixture exclusions, within-dataset subsets, minimum sample sizes, and regional omissions (Figure 4). Window-size results at 250 kb, 500 kb, and 1 Mb are shown in Figure S2. These analyses were treated as robustness checks rather than independent confirmatory tests.</w:t>
       </w:r>
     </w:p>
     <w:p>
@@ -496,7 +538,28 @@
           <w:i w:val="0"/>
           <w:sz w:val="24"/>
         </w:rPr>
-        <w:t>The 500-kb ABO-centered scan identified 834 Neanderthal or Both source segments, of which 129 overlapped the ABO gene. Of the 834 interval segments, 335 had tied maximum reference similarity and were not forced to a lineage. In the Indigenous American HGDP subset, one Pima segment overlapped ABO and one Maya segment lay downstream within the wider interval. Both were Vindija-closest, but two segments among 41 represented individuals do not support a regional proportion or migration-route inference (Figure 4; Table 2). O2 frequencies, an Ancient North Eurasian context diagram, and the non-comparable ancient-window extraction are provided only as Figure S3, Figure S4, and Figure S5.</w:t>
+        <w:t>The 500-kb ABO-centered scan identified 834 Neanderthal or Both source segments, of which 129 overlapped the ABO gene. Of the 834 interval segments, 335 had tied maximum reference similarity and were not forced to a lineage. In the Indigenous American HGDP subset, one Pima segment overlapped ABO and one Maya segment lay downstream within the wider interval. Both were Vindija-closest, but two segments among 41 represented individuals do not support a regional proportion or migration-route inference (Figure 5; Table 2).</w:t>
+      </w:r>
+    </w:p>
+    <w:p>
+      <w:pPr>
+        <w:pStyle w:val="Heading2"/>
+      </w:pPr>
+      <w:r>
+        <w:t>ABO-related and global contextual figures</w:t>
+      </w:r>
+    </w:p>
+    <w:p>
+      <w:pPr>
+        <w:ind w:firstLine="432"/>
+      </w:pPr>
+      <w:r>
+        <w:rPr>
+          <w:rFonts w:ascii="Times New Roman" w:hAnsi="Times New Roman"/>
+          <w:i w:val="0"/>
+          <w:sz w:val="24"/>
+        </w:rPr>
+        <w:t>The O2-defining allele and ABO-window carrier summaries use different sources and are displayed descriptively rather than as an association analysis (Figure 6). The Ancient North Eurasian pathway is retained as a testable contextual hypothesis, not a route inferred from the two Indigenous American segment records (Figure 7). Ancient and modern ABO-window observations were produced by different pipelines and permit no formal temporal comparison (Figure 8). A literature-derived global bivariate map provides broad Neanderthal and Denisovan ancestry context; its approximate values were not used in the statistical models (Figure 9).</w:t>
       </w:r>
     </w:p>
     <w:p>
@@ -1044,7 +1107,7 @@
         <w:t xml:space="preserve">Figure 3. </w:t>
       </w:r>
       <w:r>
-        <w:t>Descriptive distance correlations across population, sample-size, dataset, zero-distance, and leave-one-continent-out sensitivities.</w:t>
+        <w:t>Polygon-based Minard-style schematic of human dispersal and archaic introgression. Band widths, branch positions, and event placement are illustrative and do not estimate migration magnitude, ancestry proportion, or a route supported by the present analysis.</w:t>
       </w:r>
     </w:p>
     <w:p>
@@ -1058,7 +1121,77 @@
         <w:t xml:space="preserve">Figure 4. </w:t>
       </w:r>
       <w:r>
+        <w:t>Descriptive distance correlations across population, sample-size, dataset, zero-distance, and leave-one-continent-out sensitivities.</w:t>
+      </w:r>
+    </w:p>
+    <w:p>
+      <w:pPr>
+        <w:spacing w:line="360" w:lineRule="auto" w:after="160"/>
+      </w:pPr>
+      <w:r>
+        <w:rPr>
+          <w:b/>
+        </w:rPr>
+        <w:t xml:space="preserve">Figure 5. </w:t>
+      </w:r>
+      <w:r>
         <w:t>Secondary ABO-centered analysis. Closest-reference counts retain tied maxima. The Pima segment overlaps ABO; the Maya segment is within the wider interval but does not overlap the gene. Counts are segments, not regional frequencies.</w:t>
+      </w:r>
+    </w:p>
+    <w:p>
+      <w:pPr>
+        <w:spacing w:line="360" w:lineRule="auto" w:after="160"/>
+      </w:pPr>
+      <w:r>
+        <w:rPr>
+          <w:b/>
+        </w:rPr>
+        <w:t xml:space="preserve">Figure 6. </w:t>
+      </w:r>
+      <w:r>
+        <w:t>O2-defining allele frequencies and ABO-window segment-carrier frequencies. The panels use different sources and are not an association analysis; proximity does not establish that the O2 allele is Neanderthal-derived.</w:t>
+      </w:r>
+    </w:p>
+    <w:p>
+      <w:pPr>
+        <w:spacing w:line="360" w:lineRule="auto" w:after="160"/>
+      </w:pPr>
+      <w:r>
+        <w:rPr>
+          <w:b/>
+        </w:rPr>
+        <w:t xml:space="preserve">Figure 7. </w:t>
+      </w:r>
+      <w:r>
+        <w:t>Ancient North Eurasian contextual hypothesis. Dashed arrows represent a testable narrative, not evidence that either observed segment followed the illustrated route.</w:t>
+      </w:r>
+    </w:p>
+    <w:p>
+      <w:pPr>
+        <w:spacing w:line="360" w:lineRule="auto" w:after="160"/>
+      </w:pPr>
+      <w:r>
+        <w:rPr>
+          <w:b/>
+        </w:rPr>
+        <w:t xml:space="preserve">Figure 8. </w:t>
+      </w:r>
+      <w:r>
+        <w:t>Descriptive ancient and modern ABO-window summaries generated by different pipelines; no formal temporal comparison is made.</w:t>
+      </w:r>
+    </w:p>
+    <w:p>
+      <w:pPr>
+        <w:spacing w:line="360" w:lineRule="auto" w:after="160"/>
+      </w:pPr>
+      <w:r>
+        <w:rPr>
+          <w:b/>
+        </w:rPr>
+        <w:t xml:space="preserve">Figure 9. </w:t>
+      </w:r>
+      <w:r>
+        <w:t>Literature-derived global context. Circle size represents approximate Neanderthal ancestry and color intensity represents approximate Denisovan ancestry. Values were not used in the pairwise statistical models.</w:t>
       </w:r>
     </w:p>
     <w:p>
@@ -1095,48 +1228,6 @@
       </w:r>
       <w:r>
         <w:t>Descriptive geographic distance correlations at 250-kb, 500-kb, and 1-Mb window sizes; QAP results are tabulated in Supplementary Data.</w:t>
-      </w:r>
-    </w:p>
-    <w:p>
-      <w:pPr>
-        <w:spacing w:line="360" w:lineRule="auto" w:after="160"/>
-      </w:pPr>
-      <w:r>
-        <w:rPr>
-          <w:b/>
-        </w:rPr>
-        <w:t xml:space="preserve">Figure S3. </w:t>
-      </w:r>
-      <w:r>
-        <w:t>O2-defining allele frequencies and ABO-window segment-carrier frequencies. The panels use different sources and are not an association analysis.</w:t>
-      </w:r>
-    </w:p>
-    <w:p>
-      <w:pPr>
-        <w:spacing w:line="360" w:lineRule="auto" w:after="160"/>
-      </w:pPr>
-      <w:r>
-        <w:rPr>
-          <w:b/>
-        </w:rPr>
-        <w:t xml:space="preserve">Figure S4. </w:t>
-      </w:r>
-      <w:r>
-        <w:t>Ancient North Eurasian contextual hypothesis. Dashed arrows represent a testable narrative, not evidence that either observed segment followed the illustrated route.</w:t>
-      </w:r>
-    </w:p>
-    <w:p>
-      <w:pPr>
-        <w:spacing w:line="360" w:lineRule="auto" w:after="160"/>
-      </w:pPr>
-      <w:r>
-        <w:rPr>
-          <w:b/>
-        </w:rPr>
-        <w:t xml:space="preserve">Figure S5. </w:t>
-      </w:r>
-      <w:r>
-        <w:t>Descriptive ancient and modern ABO-window summaries generated by different pipelines; no formal temporal comparison is made.</w:t>
       </w:r>
     </w:p>
     <w:sectPr>

</xml_diff>

<commit_message>
Define manuscript abbreviations at first use
Co-Authored-By: Tatsuki Onishi <bougtoir@gmail.com>
</commit_message>
<xml_diff>
--- a/denisovan-archaic-dna-analysis/docs/ajba_submission/manuscript_ajba.docx
+++ b/denisovan-archaic-dna-analysis/docs/ajba_submission/manuscript_ajba.docx
@@ -74,7 +74,7 @@
         <w:spacing w:line="360" w:lineRule="auto"/>
       </w:pPr>
       <w:r>
-        <w:t>Objectives: Archaic-like segments around the ABO blood-group locus have been proposed as clues to blood-group history and human dispersal, but their interpretation lacks a genome-wide geographic baseline. We tested whether population-level genomic profiles of inferred Neanderthal- and Denisovan-like segments become less similar with geographic distance. Materials and Methods: High-confidence hmmix calls from 3,134 individuals in 66 populations were summarized in 500-kb windows. Each individual-haplotype-window contributed at most one presence, constraining population frequencies to 0-1. Pearson similarity was calculated for 2,145 population pairs. Distance associations were evaluated with population-label quadratic assignment permutations, population-deletion analyses, and sensitivities to window size, similarity metric, sample-size threshold, dataset, zero-distance pairs, and regional omission. Results: Similarity declined with distance for Neanderthal (raw r=-0.497) and Denisovan (raw r=-0.462) profiles. Expanded descriptive models that also included designated recent-admixture involvement, same-continent status, and same-dataset status had partial distance correlations of -0.369 and -0.326; population-label permutation P values for distance were 0.0001 and 0.0002. No positive-residual non-admixed pair met both z&gt;2 and false-discovery-rate q&lt;0.10. Conclusions: Archaic-segment profile similarity contains a broad geographic distance-decay signal, but the analysis does not identify exceptional population connections or demonstrate specific migration routes. A secondary ABO-window analysis remains hypothesis-generating.</w:t>
+        <w:t>Objectives: Archaic-like segments around the ABO blood-group locus have been proposed as clues to blood-group history and human dispersal, but their interpretation lacks a genome-wide geographic baseline. We tested whether population-level genomic profiles of inferred Neanderthal- and Denisovan-like segments become less similar with geographic distance. Materials and Methods: High-confidence archaic-introgression calls from 3,134 individuals in 66 populations were obtained using hmmix, a hidden Markov model-based detection method, and summarized in 500-kilobase (kb) windows. Each individual-haplotype-window contributed at most one presence, constraining population frequencies to 0-1. Pearson similarity was calculated for 2,145 population pairs. Distance associations were evaluated with population-label quadratic assignment permutations, population-deletion analyses, and sensitivities to window size, similarity metric, sample-size threshold, dataset, zero-distance pairs, and regional omission. Results: Similarity declined with distance for Neanderthal (raw r=-0.497) and Denisovan (raw r=-0.462) profiles. Expanded descriptive models that also included designated recent-admixture involvement, same-continent status, and same-dataset status had partial distance correlations of -0.369 and -0.326; population-label permutation P values for distance were 0.0001 and 0.0002. No positive-residual non-admixed pair met both z&gt;2 and false-discovery-rate q&lt;0.10. Conclusions: Archaic-segment profile similarity contains a broad geographic distance-decay signal, but the analysis does not identify exceptional population connections or demonstrate specific migration routes. A secondary ABO-window analysis remains hypothesis-generating.</w:t>
       </w:r>
     </w:p>
     <w:p>
@@ -124,7 +124,7 @@
           <w:i w:val="0"/>
           <w:sz w:val="24"/>
         </w:rPr>
-        <w:t>Geographic gradients in archaic ancestry may reflect range expansions and serial demographic processes rather than a single migration event (Quilodran et al. 2023). Pairwise profile similarity offers a direct descriptive measure of shared genomic distribution, but it creates dyadic data: every population appears in many pair rows. Standard row-wise regression tests, bootstraps, or response shuffles therefore do not preserve the population-level dependence structure. Quadratic assignment procedures address this problem by permuting population labels on a complete matrix (Krackhardt 1988; Dekker, Krackhardt, and Snijders 2007).</w:t>
+        <w:t>Geographic gradients in archaic ancestry may reflect range expansions and serial demographic processes rather than a single migration event (Quilodran et al. 2023). Pairwise profile similarity offers a direct descriptive measure of shared genomic distribution, but it creates dyadic data: every population appears in many pair rows. Standard row-wise regression tests, bootstraps, or response shuffles therefore do not preserve the population-level dependence structure. Quadratic assignment procedures (QAP) address this problem by permuting population labels on a complete matrix (Krackhardt 1988; Dekker, Krackhardt, and Snijders 2007).</w:t>
       </w:r>
     </w:p>
     <w:p>
@@ -137,7 +137,7 @@
           <w:i w:val="0"/>
           <w:sz w:val="24"/>
         </w:rPr>
-        <w:t>The primary objective was to test whether Neanderthal- and Denisovan-segment profile similarity declines with great-circle distance across 66 populations from the 1000 Genomes Project and Human Genome Diversity Project. We also tested robustness to alternative genomic windows, similarity metrics, sample-size thresholds, datasets, co-located pairs, and regional omission. A secondary analysis of the ABO-centered interval was retained because ABO has an unusually deep allelic history and has motivated founder-effect and archaic-background hypotheses (Calafell et al. 2008; Halverson and Bolnick 2008; Segurel et al. 2012; Condemi et al. 2021). This focal analysis was prespecified as exploratory and was not used to infer a migration route.</w:t>
+        <w:t>The primary objective was to test whether Neanderthal- and Denisovan-segment profile similarity declines with great-circle distance across 66 populations from the 1000 Genomes Project and Human Genome Diversity Project (HGDP). We also tested robustness to alternative genomic windows, similarity metrics, sample-size thresholds, datasets, co-located pairs, and regional omission. A secondary analysis of the interval centered on the ABO blood-group locus was retained because ABO has an unusually deep allelic history and has motivated founder-effect and archaic-background hypotheses (Calafell et al. 2008; Halverson and Bolnick 2008; Segurel et al. 2012; Condemi et al. 2021). This focal analysis was prespecified as exploratory and was not used to infer a migration route.</w:t>
       </w:r>
     </w:p>
     <w:p>
@@ -166,7 +166,7 @@
           <w:i w:val="0"/>
           <w:sz w:val="24"/>
         </w:rPr>
-        <w:t>We analyzed publicly archived hmmix segment calls from 1000 Genomes and HGDP samples in Zenodo record 14136628. Hmmix detects candidate archaic sequence without requiring an unadmixed modern outgroup (Skov et al. 2018). Source population definitions followed the 1000 Genomes and HGDP resources (1000 Genomes Project Consortium 2015; Bergström et al. 2020). SHA-256 checksums of both raw files are written to the analysis provenance record.</w:t>
+        <w:t>We analyzed publicly archived segment calls generated with hmmix, a hidden Markov model-based method that detects candidate archaic sequence without requiring an unadmixed modern outgroup (Skov et al. 2018). Segment files for the 1000 Genomes Project and Human Genome Diversity Project (HGDP) samples were obtained from Zenodo record 14136628. Source population definitions followed those resources (1000 Genomes Project Consortium 2015; Bergström et al. 2020). Secure Hash Algorithm 256 (SHA-256) checksums of both raw files are written to the analysis provenance record.</w:t>
       </w:r>
     </w:p>
     <w:p>
@@ -200,7 +200,7 @@
           <w:i w:val="0"/>
           <w:sz w:val="24"/>
         </w:rPr>
-        <w:t>Autosomes were partitioned into 500-kb windows. Within each ancestry category, overlapping or fragmented source segments were collapsed so that each individual-haplotype-window contributed at most one presence. For each population and window, unique haplotype presences were divided by twice the number of represented individuals. A runtime validity check required every frequency to lie between 0 and 1.</w:t>
+        <w:t>Autosomes were partitioned into 500-kilobase (kb) windows. Within each ancestry category, overlapping or fragmented source segments were collapsed so that each individual-haplotype-window contributed at most one presence. For each population and window, unique haplotype presences were divided by twice the number of represented individuals. A runtime validity check required every frequency to lie between 0 and 1.</w:t>
       </w:r>
     </w:p>
     <w:p>
@@ -247,7 +247,7 @@
           <w:i w:val="0"/>
           <w:sz w:val="24"/>
         </w:rPr>
-        <w:t>The primary expanded descriptive model regressed pairwise similarity on distance per 1,000 km, involvement of one of four designated recently admixed American populations (PUR, CLM, MXL, or PEL), same-continent status, and same-dataset status. These indicators are coarse sensitivity covariates, not individual ancestry estimates or causal controls. Distance-only models were also fit.</w:t>
+        <w:t>The primary expanded descriptive model regressed pairwise similarity on distance per 1,000 km, involvement of one of four designated recently admixed American populations: Puerto Ricans from Puerto Rico (PUR), Colombians from Medellín, Colombia (CLM), people with Mexican ancestry from Los Angeles, United States (MXL), or Peruvians from Lima, Peru (PEL). The model also included same-continent status and same-dataset status. These indicators are coarse sensitivity covariates, not individual ancestry estimates or causal controls. Distance-only models were also fit.</w:t>
       </w:r>
     </w:p>
     <w:p>
@@ -294,7 +294,7 @@
           <w:i w:val="0"/>
           <w:sz w:val="24"/>
         </w:rPr>
-        <w:t>Outlier analysis was restricted to the complete matrix after removing PUR, CLM, MXL, and PEL. Similarity was modeled using distance, same-continent status, and same-dataset status. Positive residuals were standardized by the residual standard deviation. For every pair, a one-sided nominal P value was calculated from its own residual null distribution across 9,999 population-label permutations. The Benjamini-Hochberg procedure was applied jointly to all non-admixed pairs within each ancestry analysis (Benjamini and Hochberg 1995). A supported positive outlier required z&gt;2 and q&lt;0.10.</w:t>
+        <w:t>Outlier analysis was restricted to the complete matrix after removing PUR, CLM, MXL, and PEL. Similarity was modeled using distance, same-continent status, and same-dataset status. Positive residuals were standardized by the residual standard deviation. For every pair, a one-sided nominal P value was calculated from its own residual null distribution across 9,999 population-label permutations. The Benjamini-Hochberg procedure was applied jointly to all non-admixed pairs within each ancestry analysis to control the false discovery rate (FDR) (Benjamini and Hochberg 1995). A supported positive outlier required z&gt;2 and q&lt;0.10.</w:t>
       </w:r>
     </w:p>
     <w:p>
@@ -315,7 +315,7 @@
           <w:i w:val="0"/>
           <w:sz w:val="24"/>
         </w:rPr>
-        <w:t>We repeated distance-only population-label tests for 250-kb, 500-kb, and 1-Mb windows. At 500 kb, robustness summaries compared Pearson, Spearman, and cosine similarity; minimum population sizes of 7, 10, 15, and 20; the complete dataset, non-admixed populations, 1000 Genomes-only and HGDP-only subsets; exclusion of zero-distance pairs; and leave-one-continent-out subsets. Full-window Pearson correlation and presence-absence Jaccard similarity assessed sensitivity to the nonzero-window union. Sensitivity tests used 999 population-label permutations. No genome-wide callable mask was available in the source release, so mask-adjusted profiles could not be evaluated.</w:t>
+        <w:t>We repeated distance-only population-label tests for 250-kb, 500-kb, and 1-megabase (Mb) windows. At 500 kb, robustness summaries compared Pearson, Spearman, and cosine similarity; minimum population sizes of 7, 10, 15, and 20; the complete dataset, non-admixed populations, 1000 Genomes-only and HGDP-only subsets; exclusion of zero-distance pairs; and leave-one-continent-out subsets. Full-window Pearson correlation and presence-absence Jaccard similarity assessed sensitivity to the nonzero-window union. Sensitivity tests used 999 population-label permutations. No genome-wide callable mask was available in the source release, so mask-adjusted profiles could not be evaluated.</w:t>
       </w:r>
     </w:p>
     <w:p>
@@ -336,7 +336,7 @@
           <w:i w:val="0"/>
           <w:sz w:val="24"/>
         </w:rPr>
-        <w:t>The ABO gene was defined on GRCh38 as chr9:133,233,278-133,276,024. We distinguished strict gene overlap from any overlap with a 500-kb interval spanning chr9:133.0-133.5 Mb. Population carrier frequencies used unique individuals in the numerator and all represented source individuals in the denominator.</w:t>
+        <w:t>The ABO gene was defined on Genome Reference Consortium Human Build 38 (GRCh38) as chromosome 9 (chr9):133,233,278-133,276,024. We distinguished strict gene overlap from any overlap with a 500-kb interval spanning chr9:133.0-133.5 Mb. Population carrier frequencies used unique individuals in the numerator and all represented source individuals in the denominator.</w:t>
       </w:r>
     </w:p>
     <w:p>
@@ -349,7 +349,7 @@
           <w:i w:val="0"/>
           <w:sz w:val="24"/>
         </w:rPr>
-        <w:t>For Neanderthal or Both segments in the interval, similarity counts to Altai, Vindija, and Chagyrskaya were compared; tied maxima remained ties. The Vindija reference is a high-coverage Neanderthal genome (Prüfer et al. 2017). The O2-defining rs41302905 T allele was summarized from Ensembl/1000 Genomes frequencies and published Solomon Islands frequencies (Ohashi et al. 2006). Ancient-window observations were descriptively extracted from public outputs associated with Iasi et al. (2024); ancient and modern calls were not directly compared statistically.</w:t>
+        <w:t>For Neanderthal or Both segments in the interval, similarity counts to Altai, Vindija, and Chagyrskaya were compared; tied maxima remained ties. The Vindija reference is a high-coverage Neanderthal genome (Prüfer et al. 2017). The O2 blood-group subtype-defining rs41302905 T allele was summarized from Ensembl/1000 Genomes frequencies and published Solomon Islands frequencies (Ohashi et al. 2006). Ancient-window observations were descriptively extracted from public outputs associated with Iasi et al. (2024); ancient and modern calls were not directly compared statistically.</w:t>
       </w:r>
     </w:p>
     <w:p>
@@ -383,7 +383,7 @@
           <w:i w:val="0"/>
           <w:sz w:val="24"/>
         </w:rPr>
-        <w:t>No source community or stakeholder representatives participated in the design, analysis, interpretation, or dissemination of the present secondary study, and no direct community return-of-results process was conducted. Because the dataset includes Indigenous participants and the topic can affect narratives of ancestry and migration, analyses were interpreted in light of Indigenous data-governance guidance and the CARE principles (Claw et al. 2018; Carroll et al. 2020). Population labels were retained only when needed for transparent source-data description; locus-level observations were not generalized to communities, and migration routes were not assigned from these data. The public article, code, and derived aggregate results are the current means of results availability. These disclosures follow the expanded AJBA guidance on ethical review and stakeholder communication (Turner 2025).</w:t>
+        <w:t>No source community or stakeholder representatives participated in the design, analysis, interpretation, or dissemination of the present secondary study, and no direct community return-of-results process was conducted. Because the dataset includes Indigenous participants and the topic can affect narratives of ancestry and migration, analyses were interpreted in light of Indigenous data-governance guidance and the Collective Benefit, Authority to Control, Responsibility, and Ethics (CARE) Principles (Claw et al. 2018; Carroll et al. 2020). Population labels were retained only when needed for transparent source-data description; locus-level observations were not generalized to communities, and migration routes were not assigned from these data. The public article, code, and derived aggregate results are the current means of results availability. These disclosures follow the expanded journal guidance on ethical review and stakeholder communication (Turner 2025).</w:t>
       </w:r>
     </w:p>
     <w:p>
@@ -475,7 +475,7 @@
           <w:i w:val="0"/>
           <w:sz w:val="24"/>
         </w:rPr>
-        <w:t>A polygon-based Minard diagram places the analysis within broad dispersal and archaic-introgression contexts (Figure 3). Band widths, branch positions, and event placement are schematic and are not estimates from the present pairwise analysis.</w:t>
+        <w:t>A Minard-style diagram places the analysis within broad dispersal and archaic-introgression contexts (Figure 3). Band widths, branch positions, and event placement are schematic and are not estimates from the present pairwise analysis.</w:t>
       </w:r>
     </w:p>
     <w:p>
@@ -1107,7 +1107,7 @@
         <w:t xml:space="preserve">Figure 3. </w:t>
       </w:r>
       <w:r>
-        <w:t>Polygon-based Minard-style schematic of human dispersal and archaic introgression. Band widths, branch positions, and event placement are illustrative and do not estimate migration magnitude, ancestry proportion, or a route supported by the present analysis.</w:t>
+        <w:t>Minard-style schematic of human dispersal and archaic introgression. Band widths, branch positions, and event placement are illustrative and do not estimate migration magnitude, ancestry proportion, or a route supported by the present analysis.</w:t>
       </w:r>
     </w:p>
     <w:p>
@@ -1135,7 +1135,7 @@
         <w:t xml:space="preserve">Figure 5. </w:t>
       </w:r>
       <w:r>
-        <w:t>Descriptive geographic distance correlations at 250-kb, 500-kb, and 1-Mb window sizes. QAP results are tabulated in Supplementary Data.</w:t>
+        <w:t>Descriptive geographic distance correlations at 250-kb, 500-kb, and 1-Mb window sizes. Quadratic assignment procedure results are tabulated in Supplementary Data.</w:t>
       </w:r>
     </w:p>
     <w:p>
@@ -1163,7 +1163,7 @@
         <w:t xml:space="preserve">Figure 7. </w:t>
       </w:r>
       <w:r>
-        <w:t>O2-defining allele frequencies and ABO-window segment-carrier frequencies. The panels use different sources and are not an association analysis; proximity does not establish that the O2 allele is Neanderthal-derived.</w:t>
+        <w:t>O2 blood-group subtype-defining allele frequencies and ABO-window segment-carrier frequencies. The panels use different sources and are not an association analysis; proximity does not establish that the O2 allele is Neanderthal-derived.</w:t>
       </w:r>
     </w:p>
     <w:p>

</xml_diff>